<commit_message>
actualizado general de BOM y añadido documentacion final
</commit_message>
<xml_diff>
--- a/Planificacion/Words/Anexo_1_Esquematicos.docx
+++ b/Planificacion/Words/Anexo_1_Esquematicos.docx
@@ -16,103 +16,356 @@
         <w:t>Anexo 1: Esquemáticos</w:t>
       </w:r>
     </w:p>
-    <w:p>
-      <w:pPr>
-        <w:pStyle w:val="Ttulo1"/>
+    <w:sdt>
+      <w:sdtPr>
         <w:rPr>
           <w:lang w:val="es-ES"/>
         </w:rPr>
-      </w:pPr>
-      <w:r>
+        <w:id w:val="-657537619"/>
+        <w:docPartObj>
+          <w:docPartGallery w:val="Table of Contents"/>
+          <w:docPartUnique/>
+        </w:docPartObj>
+      </w:sdtPr>
+      <w:sdtEndPr>
         <w:rPr>
-          <w:lang w:val="es-ES"/>
+          <w:rFonts w:asciiTheme="minorHAnsi" w:eastAsiaTheme="minorEastAsia" w:hAnsiTheme="minorHAnsi" w:cstheme="minorBidi"/>
+          <w:color w:val="auto"/>
+          <w:sz w:val="22"/>
+          <w:szCs w:val="22"/>
+          <w:lang w:val="en-US"/>
         </w:rPr>
-        <w:t>Índice</w:t>
-      </w:r>
-    </w:p>
-    <w:p>
-      <w:pPr>
-        <w:rPr>
-          <w:lang w:val="es-ES"/>
-        </w:rPr>
-      </w:pPr>
-      <w:r>
-        <w:rPr>
-          <w:lang w:val="es-ES"/>
-        </w:rPr>
-        <w:t xml:space="preserve">1. PCB </w:t>
-      </w:r>
-      <w:r>
-        <w:rPr>
-          <w:lang w:val="es-ES"/>
-        </w:rPr>
-        <w:t>0</w:t>
-      </w:r>
-      <w:r>
-        <w:rPr>
-          <w:lang w:val="es-ES"/>
-        </w:rPr>
-        <w:t xml:space="preserve"> – </w:t>
-      </w:r>
-      <w:proofErr w:type="spellStart"/>
-      <w:r>
-        <w:rPr>
-          <w:lang w:val="es-ES"/>
-        </w:rPr>
-        <w:t>Power</w:t>
-      </w:r>
-      <w:proofErr w:type="spellEnd"/>
-      <w:r>
-        <w:rPr>
-          <w:lang w:val="es-ES"/>
-        </w:rPr>
-        <w:t>-USB</w:t>
-      </w:r>
-    </w:p>
-    <w:p>
-      <w:r>
-        <w:t xml:space="preserve">2. PCB </w:t>
-      </w:r>
-      <w:r>
-        <w:t>1</w:t>
-      </w:r>
-      <w:r>
-        <w:t xml:space="preserve"> – </w:t>
-      </w:r>
-      <w:r>
-        <w:t>FPGA</w:t>
-      </w:r>
-    </w:p>
-    <w:p>
-      <w:r>
-        <w:t xml:space="preserve">3. PCB </w:t>
-      </w:r>
-      <w:r>
-        <w:t>2</w:t>
-      </w:r>
-      <w:r>
-        <w:t xml:space="preserve"> – </w:t>
-      </w:r>
-      <w:proofErr w:type="spellStart"/>
-      <w:r>
-        <w:t>Sensores</w:t>
-      </w:r>
-      <w:proofErr w:type="spellEnd"/>
-    </w:p>
-    <w:p>
-      <w:r>
-        <w:t xml:space="preserve">4. PCB </w:t>
-      </w:r>
-      <w:r>
-        <w:t>3</w:t>
-      </w:r>
-      <w:r>
-        <w:t xml:space="preserve"> – </w:t>
-      </w:r>
-      <w:r>
-        <w:t>Wireless</w:t>
-      </w:r>
-    </w:p>
+      </w:sdtEndPr>
+      <w:sdtContent>
+        <w:p>
+          <w:pPr>
+            <w:pStyle w:val="TtuloTDC"/>
+            <w:rPr>
+              <w:lang w:val="es-ES"/>
+            </w:rPr>
+          </w:pPr>
+          <w:r>
+            <w:rPr>
+              <w:lang w:val="es-ES"/>
+            </w:rPr>
+            <w:t>Índice</w:t>
+          </w:r>
+        </w:p>
+        <w:p>
+          <w:pPr>
+            <w:pStyle w:val="TDC1"/>
+            <w:tabs>
+              <w:tab w:val="right" w:leader="dot" w:pos="8630"/>
+            </w:tabs>
+            <w:rPr>
+              <w:noProof/>
+              <w:kern w:val="2"/>
+              <w:sz w:val="24"/>
+              <w:szCs w:val="24"/>
+              <w:lang w:val="es-ES" w:eastAsia="es-ES"/>
+              <w14:ligatures w14:val="standardContextual"/>
+            </w:rPr>
+          </w:pPr>
+          <w:r>
+            <w:fldChar w:fldCharType="begin"/>
+          </w:r>
+          <w:r>
+            <w:instrText xml:space="preserve"> TOC \o "1-3" \h \z \u </w:instrText>
+          </w:r>
+          <w:r>
+            <w:fldChar w:fldCharType="separate"/>
+          </w:r>
+          <w:hyperlink w:anchor="_Toc210472252" w:history="1">
+            <w:r>
+              <w:rPr>
+                <w:rStyle w:val="Hipervnculo"/>
+                <w:noProof/>
+              </w:rPr>
+              <w:t>1. PCB 0 – Power-USB</w:t>
+            </w:r>
+            <w:r>
+              <w:rPr>
+                <w:noProof/>
+                <w:webHidden/>
+              </w:rPr>
+              <w:tab/>
+            </w:r>
+            <w:r>
+              <w:rPr>
+                <w:noProof/>
+                <w:webHidden/>
+              </w:rPr>
+              <w:fldChar w:fldCharType="begin"/>
+            </w:r>
+            <w:r>
+              <w:rPr>
+                <w:noProof/>
+                <w:webHidden/>
+              </w:rPr>
+              <w:instrText xml:space="preserve"> PAGEREF _Toc210472252 \h </w:instrText>
+            </w:r>
+            <w:r>
+              <w:rPr>
+                <w:noProof/>
+                <w:webHidden/>
+              </w:rPr>
+            </w:r>
+            <w:r>
+              <w:rPr>
+                <w:noProof/>
+                <w:webHidden/>
+              </w:rPr>
+              <w:fldChar w:fldCharType="separate"/>
+            </w:r>
+            <w:r>
+              <w:rPr>
+                <w:noProof/>
+                <w:webHidden/>
+              </w:rPr>
+              <w:t>2</w:t>
+            </w:r>
+            <w:r>
+              <w:rPr>
+                <w:noProof/>
+                <w:webHidden/>
+              </w:rPr>
+              <w:fldChar w:fldCharType="end"/>
+            </w:r>
+          </w:hyperlink>
+        </w:p>
+        <w:p>
+          <w:pPr>
+            <w:pStyle w:val="TDC1"/>
+            <w:tabs>
+              <w:tab w:val="right" w:leader="dot" w:pos="8630"/>
+            </w:tabs>
+            <w:rPr>
+              <w:noProof/>
+              <w:kern w:val="2"/>
+              <w:sz w:val="24"/>
+              <w:szCs w:val="24"/>
+              <w:lang w:val="es-ES" w:eastAsia="es-ES"/>
+              <w14:ligatures w14:val="standardContextual"/>
+            </w:rPr>
+          </w:pPr>
+          <w:hyperlink w:anchor="_Toc210472253" w:history="1">
+            <w:r>
+              <w:rPr>
+                <w:rStyle w:val="Hipervnculo"/>
+                <w:noProof/>
+                <w:lang w:val="es-ES"/>
+              </w:rPr>
+              <w:t>2. PCB 1 – FPGA</w:t>
+            </w:r>
+            <w:r>
+              <w:rPr>
+                <w:noProof/>
+                <w:webHidden/>
+              </w:rPr>
+              <w:tab/>
+            </w:r>
+            <w:r>
+              <w:rPr>
+                <w:noProof/>
+                <w:webHidden/>
+              </w:rPr>
+              <w:fldChar w:fldCharType="begin"/>
+            </w:r>
+            <w:r>
+              <w:rPr>
+                <w:noProof/>
+                <w:webHidden/>
+              </w:rPr>
+              <w:instrText xml:space="preserve"> PAGEREF _Toc210472253 \h </w:instrText>
+            </w:r>
+            <w:r>
+              <w:rPr>
+                <w:noProof/>
+                <w:webHidden/>
+              </w:rPr>
+            </w:r>
+            <w:r>
+              <w:rPr>
+                <w:noProof/>
+                <w:webHidden/>
+              </w:rPr>
+              <w:fldChar w:fldCharType="separate"/>
+            </w:r>
+            <w:r>
+              <w:rPr>
+                <w:noProof/>
+                <w:webHidden/>
+              </w:rPr>
+              <w:t>5</w:t>
+            </w:r>
+            <w:r>
+              <w:rPr>
+                <w:noProof/>
+                <w:webHidden/>
+              </w:rPr>
+              <w:fldChar w:fldCharType="end"/>
+            </w:r>
+          </w:hyperlink>
+        </w:p>
+        <w:p>
+          <w:pPr>
+            <w:pStyle w:val="TDC1"/>
+            <w:tabs>
+              <w:tab w:val="right" w:leader="dot" w:pos="8630"/>
+            </w:tabs>
+            <w:rPr>
+              <w:noProof/>
+              <w:kern w:val="2"/>
+              <w:sz w:val="24"/>
+              <w:szCs w:val="24"/>
+              <w:lang w:val="es-ES" w:eastAsia="es-ES"/>
+              <w14:ligatures w14:val="standardContextual"/>
+            </w:rPr>
+          </w:pPr>
+          <w:hyperlink w:anchor="_Toc210472254" w:history="1">
+            <w:r>
+              <w:rPr>
+                <w:rStyle w:val="Hipervnculo"/>
+                <w:noProof/>
+                <w:lang w:val="es-ES"/>
+              </w:rPr>
+              <w:t>3. PCB 2 – Sensores</w:t>
+            </w:r>
+            <w:r>
+              <w:rPr>
+                <w:noProof/>
+                <w:webHidden/>
+              </w:rPr>
+              <w:tab/>
+            </w:r>
+            <w:r>
+              <w:rPr>
+                <w:noProof/>
+                <w:webHidden/>
+              </w:rPr>
+              <w:fldChar w:fldCharType="begin"/>
+            </w:r>
+            <w:r>
+              <w:rPr>
+                <w:noProof/>
+                <w:webHidden/>
+              </w:rPr>
+              <w:instrText xml:space="preserve"> PAGEREF _Toc210472254 \h </w:instrText>
+            </w:r>
+            <w:r>
+              <w:rPr>
+                <w:noProof/>
+                <w:webHidden/>
+              </w:rPr>
+            </w:r>
+            <w:r>
+              <w:rPr>
+                <w:noProof/>
+                <w:webHidden/>
+              </w:rPr>
+              <w:fldChar w:fldCharType="separate"/>
+            </w:r>
+            <w:r>
+              <w:rPr>
+                <w:noProof/>
+                <w:webHidden/>
+              </w:rPr>
+              <w:t>8</w:t>
+            </w:r>
+            <w:r>
+              <w:rPr>
+                <w:noProof/>
+                <w:webHidden/>
+              </w:rPr>
+              <w:fldChar w:fldCharType="end"/>
+            </w:r>
+          </w:hyperlink>
+        </w:p>
+        <w:p>
+          <w:pPr>
+            <w:pStyle w:val="TDC1"/>
+            <w:tabs>
+              <w:tab w:val="right" w:leader="dot" w:pos="8630"/>
+            </w:tabs>
+            <w:rPr>
+              <w:noProof/>
+              <w:kern w:val="2"/>
+              <w:sz w:val="24"/>
+              <w:szCs w:val="24"/>
+              <w:lang w:val="es-ES" w:eastAsia="es-ES"/>
+              <w14:ligatures w14:val="standardContextual"/>
+            </w:rPr>
+          </w:pPr>
+          <w:hyperlink w:anchor="_Toc210472255" w:history="1">
+            <w:r>
+              <w:rPr>
+                <w:rStyle w:val="Hipervnculo"/>
+                <w:noProof/>
+                <w:lang w:val="es-ES"/>
+              </w:rPr>
+              <w:t>4. PCB 4 – [Nombre del PCB]</w:t>
+            </w:r>
+            <w:r>
+              <w:rPr>
+                <w:noProof/>
+                <w:webHidden/>
+              </w:rPr>
+              <w:tab/>
+            </w:r>
+            <w:r>
+              <w:rPr>
+                <w:noProof/>
+                <w:webHidden/>
+              </w:rPr>
+              <w:fldChar w:fldCharType="begin"/>
+            </w:r>
+            <w:r>
+              <w:rPr>
+                <w:noProof/>
+                <w:webHidden/>
+              </w:rPr>
+              <w:instrText xml:space="preserve"> PAGEREF _Toc210472255 \h </w:instrText>
+            </w:r>
+            <w:r>
+              <w:rPr>
+                <w:noProof/>
+                <w:webHidden/>
+              </w:rPr>
+            </w:r>
+            <w:r>
+              <w:rPr>
+                <w:noProof/>
+                <w:webHidden/>
+              </w:rPr>
+              <w:fldChar w:fldCharType="separate"/>
+            </w:r>
+            <w:r>
+              <w:rPr>
+                <w:noProof/>
+                <w:webHidden/>
+              </w:rPr>
+              <w:t>10</w:t>
+            </w:r>
+            <w:r>
+              <w:rPr>
+                <w:noProof/>
+                <w:webHidden/>
+              </w:rPr>
+              <w:fldChar w:fldCharType="end"/>
+            </w:r>
+          </w:hyperlink>
+        </w:p>
+        <w:p>
+          <w:r>
+            <w:rPr>
+              <w:b/>
+              <w:bCs/>
+            </w:rPr>
+            <w:fldChar w:fldCharType="end"/>
+          </w:r>
+        </w:p>
+      </w:sdtContent>
+    </w:sdt>
     <w:p>
       <w:r>
         <w:br w:type="page"/>
@@ -122,6 +375,7 @@
       <w:pPr>
         <w:pStyle w:val="Ttulo1"/>
       </w:pPr>
+      <w:bookmarkStart w:id="0" w:name="_Toc210472252"/>
       <w:r>
         <w:lastRenderedPageBreak/>
         <w:t xml:space="preserve">1. PCB </w:t>
@@ -135,6 +389,7 @@
       <w:r>
         <w:t>Power-USB</w:t>
       </w:r>
+      <w:bookmarkEnd w:id="0"/>
     </w:p>
     <w:p>
       <w:pPr>
@@ -188,7 +443,7 @@
                     </pic:cNvPicPr>
                   </pic:nvPicPr>
                   <pic:blipFill>
-                    <a:blip r:embed="rId6">
+                    <a:blip r:embed="rId8">
                       <a:extLst>
                         <a:ext uri="{28A0092B-C50C-407E-A947-70E740481C1C}">
                           <a14:useLocalDpi xmlns:a14="http://schemas.microsoft.com/office/drawing/2010/main" val="0"/>
@@ -281,7 +536,7 @@
                     </pic:cNvPicPr>
                   </pic:nvPicPr>
                   <pic:blipFill>
-                    <a:blip r:embed="rId7">
+                    <a:blip r:embed="rId9">
                       <a:extLst>
                         <a:ext uri="{28A0092B-C50C-407E-A947-70E740481C1C}">
                           <a14:useLocalDpi xmlns:a14="http://schemas.microsoft.com/office/drawing/2010/main" val="0"/>
@@ -374,7 +629,7 @@
                     </pic:cNvPicPr>
                   </pic:nvPicPr>
                   <pic:blipFill>
-                    <a:blip r:embed="rId8">
+                    <a:blip r:embed="rId10">
                       <a:extLst>
                         <a:ext uri="{28A0092B-C50C-407E-A947-70E740481C1C}">
                           <a14:useLocalDpi xmlns:a14="http://schemas.microsoft.com/office/drawing/2010/main" val="0"/>
@@ -481,6 +736,7 @@
           <w:lang w:val="es-ES"/>
         </w:rPr>
       </w:pPr>
+      <w:bookmarkStart w:id="1" w:name="_Toc210472253"/>
       <w:r>
         <w:rPr>
           <w:lang w:val="es-ES"/>
@@ -506,6 +762,7 @@
         </w:rPr>
         <w:t>FPGA</w:t>
       </w:r>
+      <w:bookmarkEnd w:id="1"/>
     </w:p>
     <w:p>
       <w:pPr>
@@ -559,7 +816,7 @@
                     </pic:cNvPicPr>
                   </pic:nvPicPr>
                   <pic:blipFill>
-                    <a:blip r:embed="rId9">
+                    <a:blip r:embed="rId11">
                       <a:extLst>
                         <a:ext uri="{28A0092B-C50C-407E-A947-70E740481C1C}">
                           <a14:useLocalDpi xmlns:a14="http://schemas.microsoft.com/office/drawing/2010/main" val="0"/>
@@ -652,7 +909,7 @@
                     </pic:cNvPicPr>
                   </pic:nvPicPr>
                   <pic:blipFill>
-                    <a:blip r:embed="rId10">
+                    <a:blip r:embed="rId12">
                       <a:extLst>
                         <a:ext uri="{28A0092B-C50C-407E-A947-70E740481C1C}">
                           <a14:useLocalDpi xmlns:a14="http://schemas.microsoft.com/office/drawing/2010/main" val="0"/>
@@ -745,7 +1002,7 @@
                     </pic:cNvPicPr>
                   </pic:nvPicPr>
                   <pic:blipFill>
-                    <a:blip r:embed="rId11">
+                    <a:blip r:embed="rId13">
                       <a:extLst>
                         <a:ext uri="{28A0092B-C50C-407E-A947-70E740481C1C}">
                           <a14:useLocalDpi xmlns:a14="http://schemas.microsoft.com/office/drawing/2010/main" val="0"/>
@@ -852,6 +1109,7 @@
           <w:lang w:val="es-ES"/>
         </w:rPr>
       </w:pPr>
+      <w:bookmarkStart w:id="2" w:name="_Toc210472254"/>
       <w:r>
         <w:rPr>
           <w:lang w:val="es-ES"/>
@@ -877,6 +1135,7 @@
         </w:rPr>
         <w:t>Sensores</w:t>
       </w:r>
+      <w:bookmarkEnd w:id="2"/>
     </w:p>
     <w:p>
       <w:pPr>
@@ -901,9 +1160,9 @@
           <w:lang w:val="es-ES"/>
         </w:rPr>
         <w:drawing>
-          <wp:inline distT="0" distB="0" distL="0" distR="0" wp14:anchorId="755510BA" wp14:editId="3AA7EBC6">
-            <wp:extent cx="5486400" cy="3855720"/>
-            <wp:effectExtent l="0" t="0" r="0" b="0"/>
+          <wp:inline distT="0" distB="0" distL="0" distR="0" wp14:anchorId="755510BA" wp14:editId="0B15F490">
+            <wp:extent cx="5484132" cy="3855720"/>
+            <wp:effectExtent l="0" t="0" r="2540" b="0"/>
             <wp:docPr id="1096267533" name="Imagen 7"/>
             <wp:cNvGraphicFramePr>
               <a:graphicFrameLocks xmlns:a="http://schemas.openxmlformats.org/drawingml/2006/main" noChangeAspect="1"/>
@@ -912,20 +1171,13 @@
               <a:graphicData uri="http://schemas.openxmlformats.org/drawingml/2006/picture">
                 <pic:pic xmlns:pic="http://schemas.openxmlformats.org/drawingml/2006/picture">
                   <pic:nvPicPr>
-                    <pic:cNvPr id="0" name="Picture 7"/>
+                    <pic:cNvPr id="1096267533" name="Imagen 7"/>
                     <pic:cNvPicPr>
                       <a:picLocks noChangeAspect="1" noChangeArrowheads="1"/>
                     </pic:cNvPicPr>
                   </pic:nvPicPr>
                   <pic:blipFill>
-                    <a:blip r:embed="rId12">
-                      <a:extLst>
-                        <a:ext uri="{28A0092B-C50C-407E-A947-70E740481C1C}">
-                          <a14:useLocalDpi xmlns:a14="http://schemas.microsoft.com/office/drawing/2010/main" val="0"/>
-                        </a:ext>
-                      </a:extLst>
-                    </a:blip>
-                    <a:srcRect/>
+                    <a:blip r:embed="rId14"/>
                     <a:stretch>
                       <a:fillRect/>
                     </a:stretch>
@@ -933,7 +1185,7 @@
                   <pic:spPr bwMode="auto">
                     <a:xfrm>
                       <a:off x="0" y="0"/>
-                      <a:ext cx="5486400" cy="3855720"/>
+                      <a:ext cx="5484132" cy="3855720"/>
                     </a:xfrm>
                     <a:prstGeom prst="rect">
                       <a:avLst/>
@@ -1011,7 +1263,7 @@
                     </pic:cNvPicPr>
                   </pic:nvPicPr>
                   <pic:blipFill>
-                    <a:blip r:embed="rId13">
+                    <a:blip r:embed="rId15">
                       <a:extLst>
                         <a:ext uri="{28A0092B-C50C-407E-A947-70E740481C1C}">
                           <a14:useLocalDpi xmlns:a14="http://schemas.microsoft.com/office/drawing/2010/main" val="0"/>
@@ -1109,13 +1361,39 @@
           <w:lang w:val="es-ES"/>
         </w:rPr>
       </w:pPr>
+      <w:bookmarkStart w:id="3" w:name="_Toc210472255"/>
       <w:r>
         <w:rPr>
           <w:lang w:val="es-ES"/>
         </w:rPr>
         <w:lastRenderedPageBreak/>
-        <w:t>4. PCB 4 – [Nombre del PCB]</w:t>
+        <w:t xml:space="preserve">4. PCB </w:t>
       </w:r>
+      <w:r>
+        <w:rPr>
+          <w:lang w:val="es-ES"/>
+        </w:rPr>
+        <w:t>3</w:t>
+      </w:r>
+      <w:r>
+        <w:rPr>
+          <w:lang w:val="es-ES"/>
+        </w:rPr>
+        <w:t xml:space="preserve"> – [</w:t>
+      </w:r>
+      <w:r>
+        <w:rPr>
+          <w:lang w:val="es-ES"/>
+        </w:rPr>
+        <w:t>Wireless</w:t>
+      </w:r>
+      <w:r>
+        <w:rPr>
+          <w:lang w:val="es-ES"/>
+        </w:rPr>
+        <w:t>]</w:t>
+      </w:r>
+      <w:bookmarkEnd w:id="3"/>
     </w:p>
     <w:p>
       <w:pPr>
@@ -1157,7 +1435,7 @@
                     </pic:cNvPicPr>
                   </pic:nvPicPr>
                   <pic:blipFill>
-                    <a:blip r:embed="rId14">
+                    <a:blip r:embed="rId16">
                       <a:extLst>
                         <a:ext uri="{28A0092B-C50C-407E-A947-70E740481C1C}">
                           <a14:useLocalDpi xmlns:a14="http://schemas.microsoft.com/office/drawing/2010/main" val="0"/>
@@ -1226,6 +1504,12 @@
       </w:r>
     </w:p>
     <w:sectPr>
+      <w:headerReference w:type="even" r:id="rId17"/>
+      <w:headerReference w:type="default" r:id="rId18"/>
+      <w:footerReference w:type="even" r:id="rId19"/>
+      <w:footerReference w:type="default" r:id="rId20"/>
+      <w:headerReference w:type="first" r:id="rId21"/>
+      <w:footerReference w:type="first" r:id="rId22"/>
       <w:pgSz w:w="12240" w:h="15840"/>
       <w:pgMar w:top="1440" w:right="1800" w:bottom="1440" w:left="1800" w:header="720" w:footer="720" w:gutter="0"/>
       <w:cols w:space="720"/>
@@ -1233,6 +1517,116 @@
     </w:sectPr>
   </w:body>
 </w:document>
+</file>
+
+<file path=word/endnotes.xml><?xml version="1.0" encoding="utf-8"?>
+<w:endnotes xmlns:wpc="http://schemas.microsoft.com/office/word/2010/wordprocessingCanvas" xmlns:cx="http://schemas.microsoft.com/office/drawing/2014/chartex" xmlns:cx1="http://schemas.microsoft.com/office/drawing/2015/9/8/chartex" xmlns:cx2="http://schemas.microsoft.com/office/drawing/2015/10/21/chartex" xmlns:cx3="http://schemas.microsoft.com/office/drawing/2016/5/9/chartex" xmlns:cx4="http://schemas.microsoft.com/office/drawing/2016/5/10/chartex" xmlns:cx5="http://schemas.microsoft.com/office/drawing/2016/5/11/chartex" xmlns:cx6="http://schemas.microsoft.com/office/drawing/2016/5/12/chartex" xmlns:cx7="http://schemas.microsoft.com/office/drawing/2016/5/13/chartex" xmlns:cx8="http://schemas.microsoft.com/office/drawing/2016/5/14/chartex" xmlns:mc="http://schemas.openxmlformats.org/markup-compatibility/2006" xmlns:aink="http://schemas.microsoft.com/office/drawing/2016/ink" xmlns:am3d="http://schemas.microsoft.com/office/drawing/2017/model3d" xmlns:o="urn:schemas-microsoft-com:office:office" xmlns:oel="http://schemas.microsoft.com/office/2019/extlst" xmlns:r="http://schemas.openxmlformats.org/officeDocument/2006/relationships" xmlns:m="http://schemas.openxmlformats.org/officeDocument/2006/math" xmlns:v="urn:schemas-microsoft-com:vml" xmlns:wp14="http://schemas.microsoft.com/office/word/2010/wordprocessingDrawing" xmlns:wp="http://schemas.openxmlformats.org/drawingml/2006/wordprocessingDrawing" xmlns:w10="urn:schemas-microsoft-com:office:word" xmlns:w="http://schemas.openxmlformats.org/wordprocessingml/2006/main" xmlns:w14="http://schemas.microsoft.com/office/word/2010/wordml" xmlns:w15="http://schemas.microsoft.com/office/word/2012/wordml" xmlns:w16cex="http://schemas.microsoft.com/office/word/2018/wordml/cex" xmlns:w16cid="http://schemas.microsoft.com/office/word/2016/wordml/cid" xmlns:w16="http://schemas.microsoft.com/office/word/2018/wordml" xmlns:w16du="http://schemas.microsoft.com/office/word/2023/wordml/word16du" xmlns:w16sdtdh="http://schemas.microsoft.com/office/word/2020/wordml/sdtdatahash" xmlns:w16sdtfl="http://schemas.microsoft.com/office/word/2024/wordml/sdtformatlock" xmlns:w16se="http://schemas.microsoft.com/office/word/2015/wordml/symex" xmlns:wpg="http://schemas.microsoft.com/office/word/2010/wordprocessingGroup" xmlns:wpi="http://schemas.microsoft.com/office/word/2010/wordprocessingInk" xmlns:wne="http://schemas.microsoft.com/office/word/2006/wordml" xmlns:wps="http://schemas.microsoft.com/office/word/2010/wordprocessingShape" mc:Ignorable="w14 w15 w16se w16cid w16 w16cex w16sdtdh w16sdtfl w16du wp14">
+  <w:endnote w:type="separator" w:id="-1">
+    <w:p>
+      <w:pPr>
+        <w:spacing w:after="0" w:line="240" w:lineRule="auto"/>
+      </w:pPr>
+      <w:r>
+        <w:separator/>
+      </w:r>
+    </w:p>
+  </w:endnote>
+  <w:endnote w:type="continuationSeparator" w:id="0">
+    <w:p>
+      <w:pPr>
+        <w:spacing w:after="0" w:line="240" w:lineRule="auto"/>
+      </w:pPr>
+      <w:r>
+        <w:continuationSeparator/>
+      </w:r>
+    </w:p>
+  </w:endnote>
+</w:endnotes>
+</file>
+
+<file path=word/footer1.xml><?xml version="1.0" encoding="utf-8"?>
+<w:ftr xmlns:wpc="http://schemas.microsoft.com/office/word/2010/wordprocessingCanvas" xmlns:cx="http://schemas.microsoft.com/office/drawing/2014/chartex" xmlns:cx1="http://schemas.microsoft.com/office/drawing/2015/9/8/chartex" xmlns:cx2="http://schemas.microsoft.com/office/drawing/2015/10/21/chartex" xmlns:cx3="http://schemas.microsoft.com/office/drawing/2016/5/9/chartex" xmlns:cx4="http://schemas.microsoft.com/office/drawing/2016/5/10/chartex" xmlns:cx5="http://schemas.microsoft.com/office/drawing/2016/5/11/chartex" xmlns:cx6="http://schemas.microsoft.com/office/drawing/2016/5/12/chartex" xmlns:cx7="http://schemas.microsoft.com/office/drawing/2016/5/13/chartex" xmlns:cx8="http://schemas.microsoft.com/office/drawing/2016/5/14/chartex" xmlns:mc="http://schemas.openxmlformats.org/markup-compatibility/2006" xmlns:aink="http://schemas.microsoft.com/office/drawing/2016/ink" xmlns:am3d="http://schemas.microsoft.com/office/drawing/2017/model3d" xmlns:o="urn:schemas-microsoft-com:office:office" xmlns:oel="http://schemas.microsoft.com/office/2019/extlst" xmlns:r="http://schemas.openxmlformats.org/officeDocument/2006/relationships" xmlns:m="http://schemas.openxmlformats.org/officeDocument/2006/math" xmlns:v="urn:schemas-microsoft-com:vml" xmlns:wp14="http://schemas.microsoft.com/office/word/2010/wordprocessingDrawing" xmlns:wp="http://schemas.openxmlformats.org/drawingml/2006/wordprocessingDrawing" xmlns:w10="urn:schemas-microsoft-com:office:word" xmlns:w="http://schemas.openxmlformats.org/wordprocessingml/2006/main" xmlns:w14="http://schemas.microsoft.com/office/word/2010/wordml" xmlns:w15="http://schemas.microsoft.com/office/word/2012/wordml" xmlns:w16cex="http://schemas.microsoft.com/office/word/2018/wordml/cex" xmlns:w16cid="http://schemas.microsoft.com/office/word/2016/wordml/cid" xmlns:w16="http://schemas.microsoft.com/office/word/2018/wordml" xmlns:w16du="http://schemas.microsoft.com/office/word/2023/wordml/word16du" xmlns:w16sdtdh="http://schemas.microsoft.com/office/word/2020/wordml/sdtdatahash" xmlns:w16sdtfl="http://schemas.microsoft.com/office/word/2024/wordml/sdtformatlock" xmlns:w16se="http://schemas.microsoft.com/office/word/2015/wordml/symex" xmlns:wpg="http://schemas.microsoft.com/office/word/2010/wordprocessingGroup" xmlns:wpi="http://schemas.microsoft.com/office/word/2010/wordprocessingInk" xmlns:wne="http://schemas.microsoft.com/office/word/2006/wordml" xmlns:wps="http://schemas.microsoft.com/office/word/2010/wordprocessingShape" mc:Ignorable="w14 w15 w16se w16cid w16 w16cex w16sdtdh w16sdtfl w16du wp14">
+  <w:p>
+    <w:pPr>
+      <w:pStyle w:val="Piedepgina"/>
+    </w:pPr>
+  </w:p>
+</w:ftr>
+</file>
+
+<file path=word/footer2.xml><?xml version="1.0" encoding="utf-8"?>
+<w:ftr xmlns:wpc="http://schemas.microsoft.com/office/word/2010/wordprocessingCanvas" xmlns:cx="http://schemas.microsoft.com/office/drawing/2014/chartex" xmlns:cx1="http://schemas.microsoft.com/office/drawing/2015/9/8/chartex" xmlns:cx2="http://schemas.microsoft.com/office/drawing/2015/10/21/chartex" xmlns:cx3="http://schemas.microsoft.com/office/drawing/2016/5/9/chartex" xmlns:cx4="http://schemas.microsoft.com/office/drawing/2016/5/10/chartex" xmlns:cx5="http://schemas.microsoft.com/office/drawing/2016/5/11/chartex" xmlns:cx6="http://schemas.microsoft.com/office/drawing/2016/5/12/chartex" xmlns:cx7="http://schemas.microsoft.com/office/drawing/2016/5/13/chartex" xmlns:cx8="http://schemas.microsoft.com/office/drawing/2016/5/14/chartex" xmlns:mc="http://schemas.openxmlformats.org/markup-compatibility/2006" xmlns:aink="http://schemas.microsoft.com/office/drawing/2016/ink" xmlns:am3d="http://schemas.microsoft.com/office/drawing/2017/model3d" xmlns:o="urn:schemas-microsoft-com:office:office" xmlns:oel="http://schemas.microsoft.com/office/2019/extlst" xmlns:r="http://schemas.openxmlformats.org/officeDocument/2006/relationships" xmlns:m="http://schemas.openxmlformats.org/officeDocument/2006/math" xmlns:v="urn:schemas-microsoft-com:vml" xmlns:wp14="http://schemas.microsoft.com/office/word/2010/wordprocessingDrawing" xmlns:wp="http://schemas.openxmlformats.org/drawingml/2006/wordprocessingDrawing" xmlns:w10="urn:schemas-microsoft-com:office:word" xmlns:w="http://schemas.openxmlformats.org/wordprocessingml/2006/main" xmlns:w14="http://schemas.microsoft.com/office/word/2010/wordml" xmlns:w15="http://schemas.microsoft.com/office/word/2012/wordml" xmlns:w16cex="http://schemas.microsoft.com/office/word/2018/wordml/cex" xmlns:w16cid="http://schemas.microsoft.com/office/word/2016/wordml/cid" xmlns:w16="http://schemas.microsoft.com/office/word/2018/wordml" xmlns:w16du="http://schemas.microsoft.com/office/word/2023/wordml/word16du" xmlns:w16sdtdh="http://schemas.microsoft.com/office/word/2020/wordml/sdtdatahash" xmlns:w16sdtfl="http://schemas.microsoft.com/office/word/2024/wordml/sdtformatlock" xmlns:w16se="http://schemas.microsoft.com/office/word/2015/wordml/symex" xmlns:wpg="http://schemas.microsoft.com/office/word/2010/wordprocessingGroup" xmlns:wpi="http://schemas.microsoft.com/office/word/2010/wordprocessingInk" xmlns:wne="http://schemas.microsoft.com/office/word/2006/wordml" xmlns:wps="http://schemas.microsoft.com/office/word/2010/wordprocessingShape" mc:Ignorable="w14 w15 w16se w16cid w16 w16cex w16sdtdh w16sdtfl w16du wp14">
+  <w:p>
+    <w:pPr>
+      <w:pStyle w:val="Piedepgina"/>
+    </w:pPr>
+  </w:p>
+</w:ftr>
+</file>
+
+<file path=word/footer3.xml><?xml version="1.0" encoding="utf-8"?>
+<w:ftr xmlns:wpc="http://schemas.microsoft.com/office/word/2010/wordprocessingCanvas" xmlns:cx="http://schemas.microsoft.com/office/drawing/2014/chartex" xmlns:cx1="http://schemas.microsoft.com/office/drawing/2015/9/8/chartex" xmlns:cx2="http://schemas.microsoft.com/office/drawing/2015/10/21/chartex" xmlns:cx3="http://schemas.microsoft.com/office/drawing/2016/5/9/chartex" xmlns:cx4="http://schemas.microsoft.com/office/drawing/2016/5/10/chartex" xmlns:cx5="http://schemas.microsoft.com/office/drawing/2016/5/11/chartex" xmlns:cx6="http://schemas.microsoft.com/office/drawing/2016/5/12/chartex" xmlns:cx7="http://schemas.microsoft.com/office/drawing/2016/5/13/chartex" xmlns:cx8="http://schemas.microsoft.com/office/drawing/2016/5/14/chartex" xmlns:mc="http://schemas.openxmlformats.org/markup-compatibility/2006" xmlns:aink="http://schemas.microsoft.com/office/drawing/2016/ink" xmlns:am3d="http://schemas.microsoft.com/office/drawing/2017/model3d" xmlns:o="urn:schemas-microsoft-com:office:office" xmlns:oel="http://schemas.microsoft.com/office/2019/extlst" xmlns:r="http://schemas.openxmlformats.org/officeDocument/2006/relationships" xmlns:m="http://schemas.openxmlformats.org/officeDocument/2006/math" xmlns:v="urn:schemas-microsoft-com:vml" xmlns:wp14="http://schemas.microsoft.com/office/word/2010/wordprocessingDrawing" xmlns:wp="http://schemas.openxmlformats.org/drawingml/2006/wordprocessingDrawing" xmlns:w10="urn:schemas-microsoft-com:office:word" xmlns:w="http://schemas.openxmlformats.org/wordprocessingml/2006/main" xmlns:w14="http://schemas.microsoft.com/office/word/2010/wordml" xmlns:w15="http://schemas.microsoft.com/office/word/2012/wordml" xmlns:w16cex="http://schemas.microsoft.com/office/word/2018/wordml/cex" xmlns:w16cid="http://schemas.microsoft.com/office/word/2016/wordml/cid" xmlns:w16="http://schemas.microsoft.com/office/word/2018/wordml" xmlns:w16du="http://schemas.microsoft.com/office/word/2023/wordml/word16du" xmlns:w16sdtdh="http://schemas.microsoft.com/office/word/2020/wordml/sdtdatahash" xmlns:w16sdtfl="http://schemas.microsoft.com/office/word/2024/wordml/sdtformatlock" xmlns:w16se="http://schemas.microsoft.com/office/word/2015/wordml/symex" xmlns:wpg="http://schemas.microsoft.com/office/word/2010/wordprocessingGroup" xmlns:wpi="http://schemas.microsoft.com/office/word/2010/wordprocessingInk" xmlns:wne="http://schemas.microsoft.com/office/word/2006/wordml" xmlns:wps="http://schemas.microsoft.com/office/word/2010/wordprocessingShape" mc:Ignorable="w14 w15 w16se w16cid w16 w16cex w16sdtdh w16sdtfl w16du wp14">
+  <w:p>
+    <w:pPr>
+      <w:pStyle w:val="Piedepgina"/>
+    </w:pPr>
+  </w:p>
+</w:ftr>
+</file>
+
+<file path=word/footnotes.xml><?xml version="1.0" encoding="utf-8"?>
+<w:footnotes xmlns:wpc="http://schemas.microsoft.com/office/word/2010/wordprocessingCanvas" xmlns:cx="http://schemas.microsoft.com/office/drawing/2014/chartex" xmlns:cx1="http://schemas.microsoft.com/office/drawing/2015/9/8/chartex" xmlns:cx2="http://schemas.microsoft.com/office/drawing/2015/10/21/chartex" xmlns:cx3="http://schemas.microsoft.com/office/drawing/2016/5/9/chartex" xmlns:cx4="http://schemas.microsoft.com/office/drawing/2016/5/10/chartex" xmlns:cx5="http://schemas.microsoft.com/office/drawing/2016/5/11/chartex" xmlns:cx6="http://schemas.microsoft.com/office/drawing/2016/5/12/chartex" xmlns:cx7="http://schemas.microsoft.com/office/drawing/2016/5/13/chartex" xmlns:cx8="http://schemas.microsoft.com/office/drawing/2016/5/14/chartex" xmlns:mc="http://schemas.openxmlformats.org/markup-compatibility/2006" xmlns:aink="http://schemas.microsoft.com/office/drawing/2016/ink" xmlns:am3d="http://schemas.microsoft.com/office/drawing/2017/model3d" xmlns:o="urn:schemas-microsoft-com:office:office" xmlns:oel="http://schemas.microsoft.com/office/2019/extlst" xmlns:r="http://schemas.openxmlformats.org/officeDocument/2006/relationships" xmlns:m="http://schemas.openxmlformats.org/officeDocument/2006/math" xmlns:v="urn:schemas-microsoft-com:vml" xmlns:wp14="http://schemas.microsoft.com/office/word/2010/wordprocessingDrawing" xmlns:wp="http://schemas.openxmlformats.org/drawingml/2006/wordprocessingDrawing" xmlns:w10="urn:schemas-microsoft-com:office:word" xmlns:w="http://schemas.openxmlformats.org/wordprocessingml/2006/main" xmlns:w14="http://schemas.microsoft.com/office/word/2010/wordml" xmlns:w15="http://schemas.microsoft.com/office/word/2012/wordml" xmlns:w16cex="http://schemas.microsoft.com/office/word/2018/wordml/cex" xmlns:w16cid="http://schemas.microsoft.com/office/word/2016/wordml/cid" xmlns:w16="http://schemas.microsoft.com/office/word/2018/wordml" xmlns:w16du="http://schemas.microsoft.com/office/word/2023/wordml/word16du" xmlns:w16sdtdh="http://schemas.microsoft.com/office/word/2020/wordml/sdtdatahash" xmlns:w16sdtfl="http://schemas.microsoft.com/office/word/2024/wordml/sdtformatlock" xmlns:w16se="http://schemas.microsoft.com/office/word/2015/wordml/symex" xmlns:wpg="http://schemas.microsoft.com/office/word/2010/wordprocessingGroup" xmlns:wpi="http://schemas.microsoft.com/office/word/2010/wordprocessingInk" xmlns:wne="http://schemas.microsoft.com/office/word/2006/wordml" xmlns:wps="http://schemas.microsoft.com/office/word/2010/wordprocessingShape" mc:Ignorable="w14 w15 w16se w16cid w16 w16cex w16sdtdh w16sdtfl w16du wp14">
+  <w:footnote w:type="separator" w:id="-1">
+    <w:p>
+      <w:pPr>
+        <w:spacing w:after="0" w:line="240" w:lineRule="auto"/>
+      </w:pPr>
+      <w:r>
+        <w:separator/>
+      </w:r>
+    </w:p>
+  </w:footnote>
+  <w:footnote w:type="continuationSeparator" w:id="0">
+    <w:p>
+      <w:pPr>
+        <w:spacing w:after="0" w:line="240" w:lineRule="auto"/>
+      </w:pPr>
+      <w:r>
+        <w:continuationSeparator/>
+      </w:r>
+    </w:p>
+  </w:footnote>
+</w:footnotes>
+</file>
+
+<file path=word/header1.xml><?xml version="1.0" encoding="utf-8"?>
+<w:hdr xmlns:wpc="http://schemas.microsoft.com/office/word/2010/wordprocessingCanvas" xmlns:cx="http://schemas.microsoft.com/office/drawing/2014/chartex" xmlns:cx1="http://schemas.microsoft.com/office/drawing/2015/9/8/chartex" xmlns:cx2="http://schemas.microsoft.com/office/drawing/2015/10/21/chartex" xmlns:cx3="http://schemas.microsoft.com/office/drawing/2016/5/9/chartex" xmlns:cx4="http://schemas.microsoft.com/office/drawing/2016/5/10/chartex" xmlns:cx5="http://schemas.microsoft.com/office/drawing/2016/5/11/chartex" xmlns:cx6="http://schemas.microsoft.com/office/drawing/2016/5/12/chartex" xmlns:cx7="http://schemas.microsoft.com/office/drawing/2016/5/13/chartex" xmlns:cx8="http://schemas.microsoft.com/office/drawing/2016/5/14/chartex" xmlns:mc="http://schemas.openxmlformats.org/markup-compatibility/2006" xmlns:aink="http://schemas.microsoft.com/office/drawing/2016/ink" xmlns:am3d="http://schemas.microsoft.com/office/drawing/2017/model3d" xmlns:o="urn:schemas-microsoft-com:office:office" xmlns:oel="http://schemas.microsoft.com/office/2019/extlst" xmlns:r="http://schemas.openxmlformats.org/officeDocument/2006/relationships" xmlns:m="http://schemas.openxmlformats.org/officeDocument/2006/math" xmlns:v="urn:schemas-microsoft-com:vml" xmlns:wp14="http://schemas.microsoft.com/office/word/2010/wordprocessingDrawing" xmlns:wp="http://schemas.openxmlformats.org/drawingml/2006/wordprocessingDrawing" xmlns:w10="urn:schemas-microsoft-com:office:word" xmlns:w="http://schemas.openxmlformats.org/wordprocessingml/2006/main" xmlns:w14="http://schemas.microsoft.com/office/word/2010/wordml" xmlns:w15="http://schemas.microsoft.com/office/word/2012/wordml" xmlns:w16cex="http://schemas.microsoft.com/office/word/2018/wordml/cex" xmlns:w16cid="http://schemas.microsoft.com/office/word/2016/wordml/cid" xmlns:w16="http://schemas.microsoft.com/office/word/2018/wordml" xmlns:w16du="http://schemas.microsoft.com/office/word/2023/wordml/word16du" xmlns:w16sdtdh="http://schemas.microsoft.com/office/word/2020/wordml/sdtdatahash" xmlns:w16sdtfl="http://schemas.microsoft.com/office/word/2024/wordml/sdtformatlock" xmlns:w16se="http://schemas.microsoft.com/office/word/2015/wordml/symex" xmlns:wpg="http://schemas.microsoft.com/office/word/2010/wordprocessingGroup" xmlns:wpi="http://schemas.microsoft.com/office/word/2010/wordprocessingInk" xmlns:wne="http://schemas.microsoft.com/office/word/2006/wordml" xmlns:wps="http://schemas.microsoft.com/office/word/2010/wordprocessingShape" mc:Ignorable="w14 w15 w16se w16cid w16 w16cex w16sdtdh w16sdtfl w16du wp14">
+  <w:p>
+    <w:pPr>
+      <w:pStyle w:val="Encabezado"/>
+    </w:pPr>
+  </w:p>
+</w:hdr>
+</file>
+
+<file path=word/header2.xml><?xml version="1.0" encoding="utf-8"?>
+<w:hdr xmlns:wpc="http://schemas.microsoft.com/office/word/2010/wordprocessingCanvas" xmlns:cx="http://schemas.microsoft.com/office/drawing/2014/chartex" xmlns:cx1="http://schemas.microsoft.com/office/drawing/2015/9/8/chartex" xmlns:cx2="http://schemas.microsoft.com/office/drawing/2015/10/21/chartex" xmlns:cx3="http://schemas.microsoft.com/office/drawing/2016/5/9/chartex" xmlns:cx4="http://schemas.microsoft.com/office/drawing/2016/5/10/chartex" xmlns:cx5="http://schemas.microsoft.com/office/drawing/2016/5/11/chartex" xmlns:cx6="http://schemas.microsoft.com/office/drawing/2016/5/12/chartex" xmlns:cx7="http://schemas.microsoft.com/office/drawing/2016/5/13/chartex" xmlns:cx8="http://schemas.microsoft.com/office/drawing/2016/5/14/chartex" xmlns:mc="http://schemas.openxmlformats.org/markup-compatibility/2006" xmlns:aink="http://schemas.microsoft.com/office/drawing/2016/ink" xmlns:am3d="http://schemas.microsoft.com/office/drawing/2017/model3d" xmlns:o="urn:schemas-microsoft-com:office:office" xmlns:oel="http://schemas.microsoft.com/office/2019/extlst" xmlns:r="http://schemas.openxmlformats.org/officeDocument/2006/relationships" xmlns:m="http://schemas.openxmlformats.org/officeDocument/2006/math" xmlns:v="urn:schemas-microsoft-com:vml" xmlns:wp14="http://schemas.microsoft.com/office/word/2010/wordprocessingDrawing" xmlns:wp="http://schemas.openxmlformats.org/drawingml/2006/wordprocessingDrawing" xmlns:w10="urn:schemas-microsoft-com:office:word" xmlns:w="http://schemas.openxmlformats.org/wordprocessingml/2006/main" xmlns:w14="http://schemas.microsoft.com/office/word/2010/wordml" xmlns:w15="http://schemas.microsoft.com/office/word/2012/wordml" xmlns:w16cex="http://schemas.microsoft.com/office/word/2018/wordml/cex" xmlns:w16cid="http://schemas.microsoft.com/office/word/2016/wordml/cid" xmlns:w16="http://schemas.microsoft.com/office/word/2018/wordml" xmlns:w16du="http://schemas.microsoft.com/office/word/2023/wordml/word16du" xmlns:w16sdtdh="http://schemas.microsoft.com/office/word/2020/wordml/sdtdatahash" xmlns:w16sdtfl="http://schemas.microsoft.com/office/word/2024/wordml/sdtformatlock" xmlns:w16se="http://schemas.microsoft.com/office/word/2015/wordml/symex" xmlns:wpg="http://schemas.microsoft.com/office/word/2010/wordprocessingGroup" xmlns:wpi="http://schemas.microsoft.com/office/word/2010/wordprocessingInk" xmlns:wne="http://schemas.microsoft.com/office/word/2006/wordml" xmlns:wps="http://schemas.microsoft.com/office/word/2010/wordprocessingShape" mc:Ignorable="w14 w15 w16se w16cid w16 w16cex w16sdtdh w16sdtfl w16du wp14">
+  <w:p>
+    <w:pPr>
+      <w:pStyle w:val="Encabezado"/>
+    </w:pPr>
+  </w:p>
+</w:hdr>
+</file>
+
+<file path=word/header3.xml><?xml version="1.0" encoding="utf-8"?>
+<w:hdr xmlns:wpc="http://schemas.microsoft.com/office/word/2010/wordprocessingCanvas" xmlns:cx="http://schemas.microsoft.com/office/drawing/2014/chartex" xmlns:cx1="http://schemas.microsoft.com/office/drawing/2015/9/8/chartex" xmlns:cx2="http://schemas.microsoft.com/office/drawing/2015/10/21/chartex" xmlns:cx3="http://schemas.microsoft.com/office/drawing/2016/5/9/chartex" xmlns:cx4="http://schemas.microsoft.com/office/drawing/2016/5/10/chartex" xmlns:cx5="http://schemas.microsoft.com/office/drawing/2016/5/11/chartex" xmlns:cx6="http://schemas.microsoft.com/office/drawing/2016/5/12/chartex" xmlns:cx7="http://schemas.microsoft.com/office/drawing/2016/5/13/chartex" xmlns:cx8="http://schemas.microsoft.com/office/drawing/2016/5/14/chartex" xmlns:mc="http://schemas.openxmlformats.org/markup-compatibility/2006" xmlns:aink="http://schemas.microsoft.com/office/drawing/2016/ink" xmlns:am3d="http://schemas.microsoft.com/office/drawing/2017/model3d" xmlns:o="urn:schemas-microsoft-com:office:office" xmlns:oel="http://schemas.microsoft.com/office/2019/extlst" xmlns:r="http://schemas.openxmlformats.org/officeDocument/2006/relationships" xmlns:m="http://schemas.openxmlformats.org/officeDocument/2006/math" xmlns:v="urn:schemas-microsoft-com:vml" xmlns:wp14="http://schemas.microsoft.com/office/word/2010/wordprocessingDrawing" xmlns:wp="http://schemas.openxmlformats.org/drawingml/2006/wordprocessingDrawing" xmlns:w10="urn:schemas-microsoft-com:office:word" xmlns:w="http://schemas.openxmlformats.org/wordprocessingml/2006/main" xmlns:w14="http://schemas.microsoft.com/office/word/2010/wordml" xmlns:w15="http://schemas.microsoft.com/office/word/2012/wordml" xmlns:w16cex="http://schemas.microsoft.com/office/word/2018/wordml/cex" xmlns:w16cid="http://schemas.microsoft.com/office/word/2016/wordml/cid" xmlns:w16="http://schemas.microsoft.com/office/word/2018/wordml" xmlns:w16du="http://schemas.microsoft.com/office/word/2023/wordml/word16du" xmlns:w16sdtdh="http://schemas.microsoft.com/office/word/2020/wordml/sdtdatahash" xmlns:w16sdtfl="http://schemas.microsoft.com/office/word/2024/wordml/sdtformatlock" xmlns:w16se="http://schemas.microsoft.com/office/word/2015/wordml/symex" xmlns:wpg="http://schemas.microsoft.com/office/word/2010/wordprocessingGroup" xmlns:wpi="http://schemas.microsoft.com/office/word/2010/wordprocessingInk" xmlns:wne="http://schemas.microsoft.com/office/word/2006/wordml" xmlns:wps="http://schemas.microsoft.com/office/word/2010/wordprocessingShape" mc:Ignorable="w14 w15 w16se w16cid w16 w16cex w16sdtdh w16sdtfl w16du wp14">
+  <w:p>
+    <w:pPr>
+      <w:pStyle w:val="Encabezado"/>
+    </w:pPr>
+  </w:p>
+</w:hdr>
 </file>
 
 <file path=word/numbering.xml><?xml version="1.0" encoding="utf-8"?>
@@ -2755,7 +3149,6 @@
     <w:basedOn w:val="Ttulo1"/>
     <w:next w:val="Normal"/>
     <w:uiPriority w:val="39"/>
-    <w:semiHidden/>
     <w:unhideWhenUsed/>
     <w:qFormat/>
     <w:rsid w:val="00FC693F"/>
@@ -12816,6 +13209,29 @@
         <w:shd w:val="clear" w:color="auto" w:fill="FBCAA2" w:themeFill="accent6" w:themeFillTint="7F"/>
       </w:tcPr>
     </w:tblStylePr>
+  </w:style>
+  <w:style w:type="paragraph" w:styleId="TDC1">
+    <w:name w:val="toc 1"/>
+    <w:basedOn w:val="Normal"/>
+    <w:next w:val="Normal"/>
+    <w:autoRedefine/>
+    <w:uiPriority w:val="39"/>
+    <w:unhideWhenUsed/>
+    <w:rsid w:val="00F83825"/>
+    <w:pPr>
+      <w:spacing w:after="100"/>
+    </w:pPr>
+  </w:style>
+  <w:style w:type="character" w:styleId="Hipervnculo">
+    <w:name w:val="Hyperlink"/>
+    <w:basedOn w:val="Fuentedeprrafopredeter"/>
+    <w:uiPriority w:val="99"/>
+    <w:unhideWhenUsed/>
+    <w:rsid w:val="00F83825"/>
+    <w:rPr>
+      <w:color w:val="0000FF" w:themeColor="hyperlink"/>
+      <w:u w:val="single"/>
+    </w:rPr>
   </w:style>
 </w:styles>
 </file>

</xml_diff>